<commit_message>
5.1 Login and Registration Lastest Version
</commit_message>
<xml_diff>
--- a/5.1 Login And Registration.docx
+++ b/5.1 Login And Registration.docx
@@ -5,6 +5,8 @@
     <w:p>
       <w:pPr>
         <w:rPr>
+          <w:i/>
+          <w:iCs/>
           <w:lang w:val="vi-VN"/>
         </w:rPr>
       </w:pPr>
@@ -34,106 +36,47 @@
           <w:sz w:val="40"/>
           <w:szCs w:val="40"/>
         </w:rPr>
-        <w:t>Interface Design: Login And Registration.</w:t>
-      </w:r>
-    </w:p>
-    <w:p>
+        <w:t xml:space="preserve">Interface Design: Login </w:t>
+      </w:r>
+      <w:proofErr w:type="gramStart"/>
       <w:r>
         <w:rPr>
           <w:b/>
           <w:bCs/>
-          <w:lang w:val="vi-VN"/>
-        </w:rPr>
-        <w:t xml:space="preserve"> </w:t>
-      </w:r>
-      <w:r>
-        <w:t>The wireframe below illustrates the proposed website design. As shown, the system provides four login portals for different user groups:</w:t>
-      </w:r>
-    </w:p>
-    <w:p>
-      <w:pPr>
-        <w:numPr>
-          <w:ilvl w:val="0"/>
-          <w:numId w:val="1"/>
-        </w:numPr>
-      </w:pPr>
+          <w:sz w:val="40"/>
+          <w:szCs w:val="40"/>
+        </w:rPr>
+        <w:t>And</w:t>
+      </w:r>
+      <w:proofErr w:type="gramEnd"/>
       <w:r>
         <w:rPr>
           <w:b/>
           <w:bCs/>
-        </w:rPr>
-        <w:t>Patient Portal</w:t>
-      </w:r>
-      <w:r>
-        <w:t xml:space="preserve"> </w:t>
-      </w:r>
-    </w:p>
-    <w:p>
-      <w:pPr>
-        <w:numPr>
-          <w:ilvl w:val="0"/>
-          <w:numId w:val="1"/>
-        </w:numPr>
-      </w:pPr>
-      <w:r>
-        <w:rPr>
-          <w:b/>
-          <w:bCs/>
-        </w:rPr>
-        <w:t>Clinician Portal</w:t>
-      </w:r>
-      <w:r>
-        <w:t xml:space="preserve"> </w:t>
-      </w:r>
-    </w:p>
-    <w:p>
-      <w:pPr>
-        <w:numPr>
-          <w:ilvl w:val="0"/>
-          <w:numId w:val="1"/>
-        </w:numPr>
-      </w:pPr>
-      <w:r>
-        <w:rPr>
-          <w:b/>
-          <w:bCs/>
-        </w:rPr>
-        <w:t>Staff Portal</w:t>
-      </w:r>
-      <w:r>
-        <w:t xml:space="preserve"> </w:t>
-      </w:r>
-    </w:p>
-    <w:p>
-      <w:pPr>
-        <w:numPr>
-          <w:ilvl w:val="0"/>
-          <w:numId w:val="1"/>
-        </w:numPr>
-      </w:pPr>
-      <w:r>
-        <w:rPr>
-          <w:b/>
-          <w:bCs/>
-        </w:rPr>
-        <w:t>Administrator Portal</w:t>
-      </w:r>
-    </w:p>
-    <w:p>
-      <w:pPr>
-        <w:rPr>
-          <w:lang w:val="vi-VN"/>
-        </w:rPr>
-      </w:pPr>
+          <w:sz w:val="40"/>
+          <w:szCs w:val="40"/>
+        </w:rPr>
+        <w:t xml:space="preserve"> Registration.</w:t>
+      </w:r>
       <w:r>
         <w:br/>
       </w:r>
       <w:r>
+        <w:rPr>
+          <w:lang w:val="vi-VN"/>
+        </w:rPr>
+        <w:br/>
+      </w:r>
+      <w:r>
+        <w:rPr>
+          <w:noProof/>
+          <w:lang w:val="vi-VN"/>
+        </w:rPr>
         <w:drawing>
-          <wp:inline distT="0" distB="0" distL="0" distR="0" wp14:anchorId="70AAB4ED" wp14:editId="7CA71213">
-            <wp:extent cx="5731510" cy="5645150"/>
-            <wp:effectExtent l="0" t="0" r="2540" b="0"/>
-            <wp:docPr id="162655598" name="Picture 1"/>
+          <wp:inline distT="0" distB="0" distL="0" distR="0" wp14:anchorId="7AC77724" wp14:editId="03188B98">
+            <wp:extent cx="5731510" cy="6584315"/>
+            <wp:effectExtent l="0" t="0" r="2540" b="6985"/>
+            <wp:docPr id="1779013029" name="Picture 3"/>
             <wp:cNvGraphicFramePr>
               <a:graphicFrameLocks xmlns:a="http://schemas.openxmlformats.org/drawingml/2006/main" noChangeAspect="1"/>
             </wp:cNvGraphicFramePr>
@@ -141,11 +84,17 @@
               <a:graphicData uri="http://schemas.openxmlformats.org/drawingml/2006/picture">
                 <pic:pic xmlns:pic="http://schemas.openxmlformats.org/drawingml/2006/picture">
                   <pic:nvPicPr>
-                    <pic:cNvPr id="162655598" name=""/>
+                    <pic:cNvPr id="1779013029" name="Picture 1779013029"/>
                     <pic:cNvPicPr/>
                   </pic:nvPicPr>
                   <pic:blipFill>
-                    <a:blip r:embed="rId5"/>
+                    <a:blip r:embed="rId5" cstate="print">
+                      <a:extLst>
+                        <a:ext uri="{28A0092B-C50C-407E-A947-70E740481C1C}">
+                          <a14:useLocalDpi xmlns:a14="http://schemas.microsoft.com/office/drawing/2010/main" val="0"/>
+                        </a:ext>
+                      </a:extLst>
+                    </a:blip>
                     <a:stretch>
                       <a:fillRect/>
                     </a:stretch>
@@ -153,7 +102,7 @@
                   <pic:spPr>
                     <a:xfrm>
                       <a:off x="0" y="0"/>
-                      <a:ext cx="5731510" cy="5645150"/>
+                      <a:ext cx="5731510" cy="6584315"/>
                     </a:xfrm>
                     <a:prstGeom prst="rect">
                       <a:avLst/>
@@ -173,68 +122,15 @@
       </w:r>
       <w:r>
         <w:rPr>
-          <w:lang w:val="vi-VN"/>
-        </w:rPr>
-        <w:br/>
-      </w:r>
-      <w:r>
-        <w:rPr>
-          <w:b/>
-          <w:bCs/>
-          <w:lang w:val="vi-VN"/>
-        </w:rPr>
-        <w:t>1. Patient Portal:</w:t>
-      </w:r>
-      <w:r>
-        <w:rPr>
-          <w:b/>
-          <w:bCs/>
-          <w:lang w:val="vi-VN"/>
-        </w:rPr>
-        <w:br/>
-      </w:r>
-      <w:r>
-        <w:t xml:space="preserve">When the user clicks the </w:t>
-      </w:r>
-      <w:r>
-        <w:rPr>
-          <w:i/>
-          <w:iCs/>
-        </w:rPr>
-        <w:t>Login</w:t>
-      </w:r>
-      <w:r>
-        <w:t xml:space="preserve"> button next to the </w:t>
-      </w:r>
-      <w:r>
-        <w:rPr>
-          <w:i/>
-          <w:iCs/>
-        </w:rPr>
-        <w:t>Patient Portal</w:t>
-      </w:r>
-      <w:r>
-        <w:t xml:space="preserve"> option (located at the top of </w:t>
-      </w:r>
-      <w:r>
+          <w:noProof/>
+          <w:lang w:val="vi-VN"/>
+        </w:rPr>
         <w:lastRenderedPageBreak/>
-        <w:t>the screen), the patient is directed to the login interface. At this screen, the patient enters their email address (or username) and password to access the system.</w:t>
-      </w:r>
-      <w:r>
-        <w:rPr>
-          <w:lang w:val="vi-VN"/>
-        </w:rPr>
-        <w:br/>
-      </w:r>
-      <w:r>
-        <w:rPr>
-          <w:lang w:val="vi-VN"/>
-        </w:rPr>
         <w:drawing>
-          <wp:inline distT="0" distB="0" distL="0" distR="0" wp14:anchorId="3414DAC9" wp14:editId="1F1A2E15">
-            <wp:extent cx="4503810" cy="5235394"/>
-            <wp:effectExtent l="0" t="0" r="0" b="3810"/>
-            <wp:docPr id="240309431" name="Picture 1"/>
+          <wp:inline distT="0" distB="0" distL="0" distR="0" wp14:anchorId="4E070EA7" wp14:editId="444A1B22">
+            <wp:extent cx="6074078" cy="6442603"/>
+            <wp:effectExtent l="0" t="0" r="3175" b="0"/>
+            <wp:docPr id="1949447217" name="Picture 1"/>
             <wp:cNvGraphicFramePr>
               <a:graphicFrameLocks xmlns:a="http://schemas.openxmlformats.org/drawingml/2006/main" noChangeAspect="1"/>
             </wp:cNvGraphicFramePr>
@@ -242,11 +138,17 @@
               <a:graphicData uri="http://schemas.openxmlformats.org/drawingml/2006/picture">
                 <pic:pic xmlns:pic="http://schemas.openxmlformats.org/drawingml/2006/picture">
                   <pic:nvPicPr>
-                    <pic:cNvPr id="240309431" name=""/>
+                    <pic:cNvPr id="1949447217" name="Picture 1949447217"/>
                     <pic:cNvPicPr/>
                   </pic:nvPicPr>
                   <pic:blipFill>
-                    <a:blip r:embed="rId6"/>
+                    <a:blip r:embed="rId6" cstate="print">
+                      <a:extLst>
+                        <a:ext uri="{28A0092B-C50C-407E-A947-70E740481C1C}">
+                          <a14:useLocalDpi xmlns:a14="http://schemas.microsoft.com/office/drawing/2010/main" val="0"/>
+                        </a:ext>
+                      </a:extLst>
+                    </a:blip>
                     <a:stretch>
                       <a:fillRect/>
                     </a:stretch>
@@ -254,7 +156,7 @@
                   <pic:spPr>
                     <a:xfrm>
                       <a:off x="0" y="0"/>
-                      <a:ext cx="4503810" cy="5235394"/>
+                      <a:ext cx="6140119" cy="6512651"/>
                     </a:xfrm>
                     <a:prstGeom prst="rect">
                       <a:avLst/>
@@ -266,8 +168,6 @@
           </wp:inline>
         </w:drawing>
       </w:r>
-    </w:p>
-    <w:p>
       <w:r>
         <w:rPr>
           <w:lang w:val="vi-VN"/>
@@ -276,139 +176,48 @@
       </w:r>
       <w:r>
         <w:rPr>
-          <w:i/>
-          <w:iCs/>
-        </w:rPr>
-        <w:t>New Patient Re</w:t>
-      </w:r>
-      <w:r>
-        <w:rPr>
-          <w:i/>
-          <w:iCs/>
-        </w:rPr>
-        <w:t>gistration</w:t>
-      </w:r>
-      <w:r>
-        <w:rPr>
-          <w:i/>
-          <w:iCs/>
-          <w:lang w:val="vi-VN"/>
-        </w:rPr>
-        <w:t>:</w:t>
-      </w:r>
-      <w:r>
-        <w:rPr>
           <w:lang w:val="vi-VN"/>
         </w:rPr>
         <w:br/>
       </w:r>
       <w:r>
         <w:rPr>
+          <w:b/>
+          <w:bCs/>
+          <w:lang w:val="vi-VN"/>
+        </w:rPr>
+        <w:t>- Special Ve</w:t>
+      </w:r>
+      <w:r>
+        <w:rPr>
+          <w:b/>
+          <w:bCs/>
+          <w:lang w:val="vi-VN"/>
+        </w:rPr>
+        <w:t>rification:</w:t>
+      </w:r>
+      <w:r>
+        <w:rPr>
           <w:lang w:val="vi-VN"/>
         </w:rPr>
         <w:br/>
       </w:r>
       <w:r>
         <w:rPr>
+          <w:lang w:val="vi-VN"/>
+        </w:rPr>
+        <w:br/>
+      </w:r>
+      <w:r>
+        <w:rPr>
+          <w:noProof/>
           <w:lang w:val="vi-VN"/>
         </w:rPr>
         <w:lastRenderedPageBreak/>
         <w:drawing>
-          <wp:inline distT="0" distB="0" distL="0" distR="0" wp14:anchorId="0F8BFD2D" wp14:editId="087C57D4">
-            <wp:extent cx="4770533" cy="6873836"/>
-            <wp:effectExtent l="0" t="0" r="0" b="3810"/>
-            <wp:docPr id="12219991" name="Picture 1"/>
-            <wp:cNvGraphicFramePr>
-              <a:graphicFrameLocks xmlns:a="http://schemas.openxmlformats.org/drawingml/2006/main" noChangeAspect="1"/>
-            </wp:cNvGraphicFramePr>
-            <a:graphic xmlns:a="http://schemas.openxmlformats.org/drawingml/2006/main">
-              <a:graphicData uri="http://schemas.openxmlformats.org/drawingml/2006/picture">
-                <pic:pic xmlns:pic="http://schemas.openxmlformats.org/drawingml/2006/picture">
-                  <pic:nvPicPr>
-                    <pic:cNvPr id="12219991" name=""/>
-                    <pic:cNvPicPr/>
-                  </pic:nvPicPr>
-                  <pic:blipFill>
-                    <a:blip r:embed="rId7"/>
-                    <a:stretch>
-                      <a:fillRect/>
-                    </a:stretch>
-                  </pic:blipFill>
-                  <pic:spPr>
-                    <a:xfrm>
-                      <a:off x="0" y="0"/>
-                      <a:ext cx="4770533" cy="6873836"/>
-                    </a:xfrm>
-                    <a:prstGeom prst="rect">
-                      <a:avLst/>
-                    </a:prstGeom>
-                  </pic:spPr>
-                </pic:pic>
-              </a:graphicData>
-            </a:graphic>
-          </wp:inline>
-        </w:drawing>
-      </w:r>
-      <w:r>
-        <w:rPr>
-          <w:lang w:val="vi-VN"/>
-        </w:rPr>
-        <w:br/>
-      </w:r>
-      <w:r>
-        <w:rPr>
-          <w:lang w:val="vi-VN"/>
-        </w:rPr>
-        <w:br/>
-      </w:r>
-      <w:r>
-        <w:rPr>
-          <w:b/>
-          <w:bCs/>
-          <w:lang w:val="vi-VN"/>
-        </w:rPr>
-        <w:t>- Special Ve</w:t>
-      </w:r>
-      <w:r>
-        <w:rPr>
-          <w:b/>
-          <w:bCs/>
-          <w:lang w:val="vi-VN"/>
-        </w:rPr>
-        <w:t>rification:</w:t>
-      </w:r>
-      <w:r>
-        <w:rPr>
-          <w:b/>
-          <w:bCs/>
-          <w:lang w:val="vi-VN"/>
-        </w:rPr>
-        <w:br/>
-      </w:r>
-      <w:r>
-        <w:t>Unlike staff and administrator accounts, patient accounts are not provided by the system administrator. Therefore, patients must register and verify their own accounts by following the steps below.</w:t>
-      </w:r>
-      <w:r>
-        <w:rPr>
-          <w:lang w:val="vi-VN"/>
-        </w:rPr>
-        <w:br/>
-      </w:r>
-      <w:r>
-        <w:rPr>
-          <w:lang w:val="vi-VN"/>
-        </w:rPr>
-        <w:br/>
-      </w:r>
-      <w:r>
-        <w:rPr>
-          <w:lang w:val="vi-VN"/>
-        </w:rPr>
-        <w:lastRenderedPageBreak/>
-        <w:drawing>
-          <wp:inline distT="0" distB="0" distL="0" distR="0" wp14:anchorId="0FD7CB57" wp14:editId="64A08778">
-            <wp:extent cx="4435224" cy="5235394"/>
-            <wp:effectExtent l="0" t="0" r="3810" b="3810"/>
+          <wp:inline distT="0" distB="0" distL="0" distR="0" wp14:anchorId="0FD7CB57" wp14:editId="6DC6E013">
+            <wp:extent cx="2534920" cy="2632033"/>
+            <wp:effectExtent l="0" t="0" r="0" b="0"/>
             <wp:docPr id="26957750" name="Picture 1"/>
             <wp:cNvGraphicFramePr>
               <a:graphicFrameLocks xmlns:a="http://schemas.openxmlformats.org/drawingml/2006/main" noChangeAspect="1"/>
@@ -421,7 +230,7 @@
                     <pic:cNvPicPr/>
                   </pic:nvPicPr>
                   <pic:blipFill>
-                    <a:blip r:embed="rId8"/>
+                    <a:blip r:embed="rId7"/>
                     <a:stretch>
                       <a:fillRect/>
                     </a:stretch>
@@ -429,7 +238,7 @@
                   <pic:spPr>
                     <a:xfrm>
                       <a:off x="0" y="0"/>
-                      <a:ext cx="4435224" cy="5235394"/>
+                      <a:ext cx="2551650" cy="2649404"/>
                     </a:xfrm>
                     <a:prstGeom prst="rect">
                       <a:avLst/>
@@ -443,19 +252,13 @@
       </w:r>
       <w:r>
         <w:rPr>
-          <w:lang w:val="vi-VN"/>
-        </w:rPr>
-        <w:br/>
-      </w:r>
-      <w:r>
-        <w:rPr>
-          <w:lang w:val="vi-VN"/>
-        </w:rPr>
-        <w:lastRenderedPageBreak/>
+          <w:noProof/>
+          <w:lang w:val="vi-VN"/>
+        </w:rPr>
         <w:drawing>
-          <wp:inline distT="0" distB="0" distL="0" distR="0" wp14:anchorId="3FDB44B6" wp14:editId="59E7DE25">
-            <wp:extent cx="4511431" cy="4206605"/>
-            <wp:effectExtent l="0" t="0" r="3810" b="3810"/>
+          <wp:inline distT="0" distB="0" distL="0" distR="0" wp14:anchorId="2F5675C3" wp14:editId="46AE9B2D">
+            <wp:extent cx="2819400" cy="2628900"/>
+            <wp:effectExtent l="0" t="0" r="0" b="0"/>
             <wp:docPr id="805263782" name="Picture 1"/>
             <wp:cNvGraphicFramePr>
               <a:graphicFrameLocks xmlns:a="http://schemas.openxmlformats.org/drawingml/2006/main" noChangeAspect="1"/>
@@ -468,7 +271,7 @@
                     <pic:cNvPicPr/>
                   </pic:nvPicPr>
                   <pic:blipFill>
-                    <a:blip r:embed="rId9"/>
+                    <a:blip r:embed="rId8"/>
                     <a:stretch>
                       <a:fillRect/>
                     </a:stretch>
@@ -476,7 +279,7 @@
                   <pic:spPr>
                     <a:xfrm>
                       <a:off x="0" y="0"/>
-                      <a:ext cx="4511431" cy="4206605"/>
+                      <a:ext cx="2823455" cy="2632681"/>
                     </a:xfrm>
                     <a:prstGeom prst="rect">
                       <a:avLst/>
@@ -502,6 +305,12 @@
       </w:r>
       <w:r>
         <w:rPr>
+          <w:lang w:val="vi-VN"/>
+        </w:rPr>
+        <w:br/>
+      </w:r>
+      <w:r>
+        <w:rPr>
           <w:b/>
           <w:bCs/>
           <w:lang w:val="vi-VN"/>
@@ -520,7 +329,21 @@
         <w:rPr>
           <w:lang w:val="vi-VN"/>
         </w:rPr>
-        <w:t>If patients forget their password, they can reset via Email.</w:t>
+        <w:t xml:space="preserve">If patients forget their password, they can reset via </w:t>
+      </w:r>
+      <w:proofErr w:type="gramStart"/>
+      <w:r>
+        <w:rPr>
+          <w:lang w:val="vi-VN"/>
+        </w:rPr>
+        <w:t>Email</w:t>
+      </w:r>
+      <w:proofErr w:type="gramEnd"/>
+      <w:r>
+        <w:rPr>
+          <w:lang w:val="vi-VN"/>
+        </w:rPr>
+        <w:t>.</w:t>
       </w:r>
       <w:r>
         <w:rPr>
@@ -530,6 +353,7 @@
       </w:r>
       <w:r>
         <w:rPr>
+          <w:noProof/>
           <w:lang w:val="vi-VN"/>
         </w:rPr>
         <w:drawing>
@@ -548,7 +372,7 @@
                     <pic:cNvPicPr/>
                   </pic:nvPicPr>
                   <pic:blipFill>
-                    <a:blip r:embed="rId10"/>
+                    <a:blip r:embed="rId9"/>
                     <a:stretch>
                       <a:fillRect/>
                     </a:stretch>
@@ -592,124 +416,16 @@
       </w:r>
       <w:r>
         <w:rPr>
-          <w:b/>
-          <w:bCs/>
-          <w:lang w:val="vi-VN"/>
-        </w:rPr>
-        <w:lastRenderedPageBreak/>
-        <w:br/>
-      </w:r>
-      <w:r>
-        <w:rPr>
-          <w:b/>
-          <w:bCs/>
-          <w:lang w:val="vi-VN"/>
-        </w:rPr>
-        <w:br/>
-      </w:r>
-      <w:r>
-        <w:t>These portals are intended for privileged users who cannot create their own accounts. Instead, their accounts must be created and approved by a system administrator.</w:t>
-      </w:r>
-    </w:p>
-    <w:p>
-      <w:pPr>
-        <w:rPr>
           <w:i/>
           <w:iCs/>
-          <w:lang w:val="vi-VN"/>
-        </w:rPr>
-      </w:pPr>
-      <w:r>
-        <w:t>The login process is the same as for the Patient Portal, where users enter their email address (or username) and password to sign in. However, if they do not already have an account, they must follow the account request process outlined below.</w:t>
-      </w:r>
-      <w:r>
-        <w:rPr>
-          <w:lang w:val="vi-VN"/>
-        </w:rPr>
-        <w:br/>
-      </w:r>
-      <w:r>
-        <w:rPr>
-          <w:lang w:val="vi-VN"/>
-        </w:rPr>
-        <w:br/>
-      </w:r>
-      <w:r>
-        <w:rPr>
-          <w:u w:val="single"/>
-        </w:rPr>
-        <w:t xml:space="preserve">To access one of these portals, users click the </w:t>
-      </w:r>
-      <w:r>
-        <w:rPr>
-          <w:i/>
-          <w:iCs/>
-          <w:u w:val="single"/>
-        </w:rPr>
-        <w:t>Login</w:t>
-      </w:r>
-      <w:r>
-        <w:rPr>
-          <w:u w:val="single"/>
-        </w:rPr>
-        <w:t xml:space="preserve"> button corresponding to their assigned portal.</w:t>
-      </w:r>
-      <w:r>
-        <w:rPr>
-          <w:lang w:val="vi-VN"/>
-        </w:rPr>
-        <w:br/>
-      </w:r>
-      <w:r>
-        <w:rPr>
-          <w:i/>
-          <w:iCs/>
-          <w:lang w:val="vi-VN"/>
-        </w:rPr>
-        <w:t xml:space="preserve">Step 1. Click to </w:t>
-      </w:r>
-      <w:r>
-        <w:rPr>
-          <w:i/>
-          <w:iCs/>
-          <w:lang w:val="vi-VN"/>
-        </w:rPr>
-        <w:t>N</w:t>
-      </w:r>
-      <w:r>
-        <w:rPr>
-          <w:i/>
-          <w:iCs/>
-          <w:lang w:val="vi-VN"/>
-        </w:rPr>
-        <w:t>eed an account</w:t>
-      </w:r>
-      <w:r>
-        <w:rPr>
-          <w:i/>
-          <w:iCs/>
-          <w:lang w:val="vi-VN"/>
-        </w:rPr>
-        <w:t xml:space="preserve"> or Contact Administrator:</w:t>
-      </w:r>
-    </w:p>
-    <w:p>
-      <w:pPr>
-        <w:rPr>
-          <w:i/>
-          <w:iCs/>
-          <w:lang w:val="vi-VN"/>
-        </w:rPr>
-      </w:pPr>
-      <w:r>
-        <w:rPr>
-          <w:lang w:val="vi-VN"/>
-        </w:rPr>
+          <w:noProof/>
+        </w:rPr>
+        <w:lastRenderedPageBreak/>
         <w:drawing>
-          <wp:inline distT="0" distB="0" distL="0" distR="0" wp14:anchorId="687EE5F2" wp14:editId="7D22D863">
-            <wp:extent cx="5731510" cy="5657215"/>
-            <wp:effectExtent l="0" t="0" r="2540" b="635"/>
-            <wp:docPr id="431467190" name="Picture 1"/>
+          <wp:inline distT="0" distB="0" distL="0" distR="0" wp14:anchorId="58652F1B" wp14:editId="6BE1CD4B">
+            <wp:extent cx="5731510" cy="5587365"/>
+            <wp:effectExtent l="0" t="0" r="2540" b="0"/>
+            <wp:docPr id="1424393808" name="Picture 4"/>
             <wp:cNvGraphicFramePr>
               <a:graphicFrameLocks xmlns:a="http://schemas.openxmlformats.org/drawingml/2006/main" noChangeAspect="1"/>
             </wp:cNvGraphicFramePr>
@@ -717,11 +433,17 @@
               <a:graphicData uri="http://schemas.openxmlformats.org/drawingml/2006/picture">
                 <pic:pic xmlns:pic="http://schemas.openxmlformats.org/drawingml/2006/picture">
                   <pic:nvPicPr>
-                    <pic:cNvPr id="431467190" name=""/>
+                    <pic:cNvPr id="1424393808" name="Picture 1424393808"/>
                     <pic:cNvPicPr/>
                   </pic:nvPicPr>
                   <pic:blipFill>
-                    <a:blip r:embed="rId11"/>
+                    <a:blip r:embed="rId10" cstate="print">
+                      <a:extLst>
+                        <a:ext uri="{28A0092B-C50C-407E-A947-70E740481C1C}">
+                          <a14:useLocalDpi xmlns:a14="http://schemas.microsoft.com/office/drawing/2010/main" val="0"/>
+                        </a:ext>
+                      </a:extLst>
+                    </a:blip>
                     <a:stretch>
                       <a:fillRect/>
                     </a:stretch>
@@ -729,7 +451,7 @@
                   <pic:spPr>
                     <a:xfrm>
                       <a:off x="0" y="0"/>
-                      <a:ext cx="5731510" cy="5657215"/>
+                      <a:ext cx="5731510" cy="5587365"/>
                     </a:xfrm>
                     <a:prstGeom prst="rect">
                       <a:avLst/>
@@ -743,55 +465,10 @@
       </w:r>
       <w:r>
         <w:rPr>
-          <w:lang w:val="vi-VN"/>
-        </w:rPr>
-        <w:br/>
-      </w:r>
-      <w:r>
-        <w:rPr>
-          <w:lang w:val="vi-VN"/>
-        </w:rPr>
-        <w:br/>
-      </w:r>
-      <w:r>
-        <w:rPr>
-          <w:b/>
-          <w:bCs/>
           <w:i/>
           <w:iCs/>
         </w:rPr>
-        <w:t>Step 2.</w:t>
-      </w:r>
-      <w:r>
-        <w:rPr>
-          <w:i/>
-          <w:iCs/>
-        </w:rPr>
-        <w:t xml:space="preserve"> The link directs users to the administrator's contact page, which includes the </w:t>
-      </w:r>
-      <w:r>
-        <w:rPr>
-          <w:i/>
-          <w:iCs/>
-        </w:rPr>
-        <w:lastRenderedPageBreak/>
-        <w:t xml:space="preserve">administrator's contact details and the administrative office information. Users can choose from several contact methods; however, they may also select </w:t>
-      </w:r>
-      <w:r>
-        <w:rPr>
-          <w:b/>
-          <w:bCs/>
-          <w:i/>
-          <w:iCs/>
-        </w:rPr>
-        <w:t>"Send a Request"</w:t>
-      </w:r>
-      <w:r>
-        <w:rPr>
-          <w:i/>
-          <w:iCs/>
-        </w:rPr>
-        <w:t xml:space="preserve"> to submit an account request online.</w:t>
+        <w:t>.</w:t>
       </w:r>
       <w:r>
         <w:rPr>
@@ -805,19 +482,19 @@
     <w:p>
       <w:pPr>
         <w:rPr>
-          <w:i/>
-          <w:iCs/>
+          <w:noProof/>
           <w:lang w:val="vi-VN"/>
         </w:rPr>
       </w:pPr>
       <w:r>
         <w:rPr>
+          <w:noProof/>
           <w:lang w:val="vi-VN"/>
         </w:rPr>
         <w:drawing>
-          <wp:inline distT="0" distB="0" distL="0" distR="0" wp14:anchorId="05BB7A7C" wp14:editId="26F46019">
-            <wp:extent cx="5731510" cy="5139055"/>
-            <wp:effectExtent l="0" t="0" r="2540" b="4445"/>
+          <wp:inline distT="0" distB="0" distL="0" distR="0" wp14:anchorId="05BB7A7C" wp14:editId="7F7FD4F9">
+            <wp:extent cx="2923309" cy="2621132"/>
+            <wp:effectExtent l="0" t="0" r="0" b="8255"/>
             <wp:docPr id="1117062471" name="Picture 1"/>
             <wp:cNvGraphicFramePr>
               <a:graphicFrameLocks xmlns:a="http://schemas.openxmlformats.org/drawingml/2006/main" noChangeAspect="1"/>
@@ -830,7 +507,7 @@
                     <pic:cNvPicPr/>
                   </pic:nvPicPr>
                   <pic:blipFill>
-                    <a:blip r:embed="rId12"/>
+                    <a:blip r:embed="rId11"/>
                     <a:stretch>
                       <a:fillRect/>
                     </a:stretch>
@@ -838,7 +515,7 @@
                   <pic:spPr>
                     <a:xfrm>
                       <a:off x="0" y="0"/>
-                      <a:ext cx="5731510" cy="5139055"/>
+                      <a:ext cx="2933326" cy="2630114"/>
                     </a:xfrm>
                     <a:prstGeom prst="rect">
                       <a:avLst/>
@@ -850,51 +527,28 @@
           </wp:inline>
         </w:drawing>
       </w:r>
-      <w:r>
-        <w:rPr>
-          <w:lang w:val="vi-VN"/>
-        </w:rPr>
-        <w:br/>
-      </w:r>
-      <w:r>
-        <w:rPr>
-          <w:lang w:val="vi-VN"/>
-        </w:rPr>
-        <w:br/>
-      </w:r>
-      <w:r>
-        <w:rPr>
-          <w:b/>
-          <w:bCs/>
-          <w:i/>
-          <w:iCs/>
-        </w:rPr>
-        <w:t>Step 3.</w:t>
-      </w:r>
-      <w:r>
-        <w:rPr>
-          <w:i/>
-          <w:iCs/>
-        </w:rPr>
-        <w:t xml:space="preserve"> Complete the required request form, submit it, and wait for the administrator's approval.</w:t>
-      </w:r>
     </w:p>
     <w:p>
       <w:pPr>
         <w:rPr>
+          <w:i/>
+          <w:iCs/>
           <w:lang w:val="vi-VN"/>
         </w:rPr>
       </w:pPr>
       <w:r>
         <w:rPr>
+          <w:i/>
+          <w:iCs/>
+          <w:noProof/>
           <w:lang w:val="vi-VN"/>
         </w:rPr>
         <w:lastRenderedPageBreak/>
         <w:drawing>
-          <wp:inline distT="0" distB="0" distL="0" distR="0" wp14:anchorId="3C578C63" wp14:editId="47F0C4CE">
-            <wp:extent cx="5731510" cy="5903595"/>
-            <wp:effectExtent l="0" t="0" r="2540" b="1905"/>
-            <wp:docPr id="1121392102" name="Picture 1"/>
+          <wp:inline distT="0" distB="0" distL="0" distR="0" wp14:anchorId="2A243CEC" wp14:editId="55BCE810">
+            <wp:extent cx="5731510" cy="7572375"/>
+            <wp:effectExtent l="0" t="0" r="2540" b="9525"/>
+            <wp:docPr id="1925286751" name="Picture 5"/>
             <wp:cNvGraphicFramePr>
               <a:graphicFrameLocks xmlns:a="http://schemas.openxmlformats.org/drawingml/2006/main" noChangeAspect="1"/>
             </wp:cNvGraphicFramePr>
@@ -902,11 +556,17 @@
               <a:graphicData uri="http://schemas.openxmlformats.org/drawingml/2006/picture">
                 <pic:pic xmlns:pic="http://schemas.openxmlformats.org/drawingml/2006/picture">
                   <pic:nvPicPr>
-                    <pic:cNvPr id="1121392102" name=""/>
+                    <pic:cNvPr id="1925286751" name="Picture 1925286751"/>
                     <pic:cNvPicPr/>
                   </pic:nvPicPr>
                   <pic:blipFill>
-                    <a:blip r:embed="rId13"/>
+                    <a:blip r:embed="rId12" cstate="print">
+                      <a:extLst>
+                        <a:ext uri="{28A0092B-C50C-407E-A947-70E740481C1C}">
+                          <a14:useLocalDpi xmlns:a14="http://schemas.microsoft.com/office/drawing/2010/main" val="0"/>
+                        </a:ext>
+                      </a:extLst>
+                    </a:blip>
                     <a:stretch>
                       <a:fillRect/>
                     </a:stretch>
@@ -914,7 +574,7 @@
                   <pic:spPr>
                     <a:xfrm>
                       <a:off x="0" y="0"/>
-                      <a:ext cx="5731510" cy="5903595"/>
+                      <a:ext cx="5731510" cy="7572375"/>
                     </a:xfrm>
                     <a:prstGeom prst="rect">
                       <a:avLst/>
@@ -928,15 +588,30 @@
       </w:r>
     </w:p>
     <w:p>
-      <w:r>
-        <w:rPr>
+      <w:pPr>
+        <w:rPr>
+          <w:lang w:val="vi-VN"/>
+        </w:rPr>
+      </w:pPr>
+    </w:p>
+    <w:p>
+      <w:pPr>
+        <w:rPr>
+          <w:b/>
+          <w:bCs/>
+          <w:lang w:val="vi-VN"/>
+        </w:rPr>
+      </w:pPr>
+      <w:r>
+        <w:rPr>
+          <w:noProof/>
           <w:lang w:val="vi-VN"/>
         </w:rPr>
         <w:lastRenderedPageBreak/>
         <w:drawing>
-          <wp:inline distT="0" distB="0" distL="0" distR="0" wp14:anchorId="1409E687" wp14:editId="3894A735">
-            <wp:extent cx="5731510" cy="5374005"/>
-            <wp:effectExtent l="0" t="0" r="2540" b="0"/>
+          <wp:inline distT="0" distB="0" distL="0" distR="0" wp14:anchorId="1409E687" wp14:editId="086F099C">
+            <wp:extent cx="2867891" cy="2689005"/>
+            <wp:effectExtent l="0" t="0" r="8890" b="0"/>
             <wp:docPr id="1631498169" name="Picture 1"/>
             <wp:cNvGraphicFramePr>
               <a:graphicFrameLocks xmlns:a="http://schemas.openxmlformats.org/drawingml/2006/main" noChangeAspect="1"/>
@@ -949,7 +624,7 @@
                     <pic:cNvPicPr/>
                   </pic:nvPicPr>
                   <pic:blipFill>
-                    <a:blip r:embed="rId14"/>
+                    <a:blip r:embed="rId13"/>
                     <a:stretch>
                       <a:fillRect/>
                     </a:stretch>
@@ -957,7 +632,7 @@
                   <pic:spPr>
                     <a:xfrm>
                       <a:off x="0" y="0"/>
-                      <a:ext cx="5731510" cy="5374005"/>
+                      <a:ext cx="2876379" cy="2696963"/>
                     </a:xfrm>
                     <a:prstGeom prst="rect">
                       <a:avLst/>
@@ -988,67 +663,18 @@
         </w:rPr>
         <w:t>3. Multi-User Portal</w:t>
       </w:r>
-      <w:r>
-        <w:rPr>
-          <w:b/>
-          <w:bCs/>
-          <w:lang w:val="vi-VN"/>
-        </w:rPr>
-        <w:br/>
-      </w:r>
-      <w:r>
-        <w:rPr>
-          <w:b/>
-          <w:bCs/>
-          <w:lang w:val="vi-VN"/>
-        </w:rPr>
-        <w:br/>
-      </w:r>
-      <w:r>
-        <w:t xml:space="preserve">The Staff Portal is shared by three staff roles: Receptionists, Specimen Collectors, and Laboratory Clinicians. All staff members access the system through the </w:t>
-      </w:r>
-      <w:r>
-        <w:rPr>
-          <w:i/>
-          <w:iCs/>
-        </w:rPr>
-        <w:t>Staff Portal</w:t>
-      </w:r>
-      <w:r>
-        <w:t xml:space="preserve"> by selecting the corresponding </w:t>
-      </w:r>
-      <w:r>
-        <w:rPr>
-          <w:i/>
-          <w:iCs/>
-        </w:rPr>
-        <w:t>Login</w:t>
-      </w:r>
-      <w:r>
-        <w:t xml:space="preserve"> button.</w:t>
-      </w:r>
     </w:p>
     <w:p>
       <w:r>
-        <w:t>After successfully logging in using administrator-issued credentials, users are taken to the following interface:</w:t>
-      </w:r>
-    </w:p>
-    <w:p>
-      <w:pPr>
-        <w:rPr>
-          <w:lang w:val="vi-VN"/>
-        </w:rPr>
-      </w:pPr>
-      <w:r>
-        <w:rPr>
-          <w:lang w:val="vi-VN"/>
+        <w:rPr>
+          <w:noProof/>
         </w:rPr>
         <w:lastRenderedPageBreak/>
         <w:drawing>
-          <wp:inline distT="0" distB="0" distL="0" distR="0" wp14:anchorId="63724483" wp14:editId="07D019F5">
-            <wp:extent cx="5731510" cy="5048885"/>
-            <wp:effectExtent l="0" t="0" r="2540" b="0"/>
-            <wp:docPr id="1439792302" name="Picture 1"/>
+          <wp:inline distT="0" distB="0" distL="0" distR="0" wp14:anchorId="7CFC163D" wp14:editId="6F5938C0">
+            <wp:extent cx="5731510" cy="6584315"/>
+            <wp:effectExtent l="0" t="0" r="2540" b="6985"/>
+            <wp:docPr id="1956998255" name="Picture 2"/>
             <wp:cNvGraphicFramePr>
               <a:graphicFrameLocks xmlns:a="http://schemas.openxmlformats.org/drawingml/2006/main" noChangeAspect="1"/>
             </wp:cNvGraphicFramePr>
@@ -1056,11 +682,17 @@
               <a:graphicData uri="http://schemas.openxmlformats.org/drawingml/2006/picture">
                 <pic:pic xmlns:pic="http://schemas.openxmlformats.org/drawingml/2006/picture">
                   <pic:nvPicPr>
-                    <pic:cNvPr id="1439792302" name=""/>
+                    <pic:cNvPr id="1956998255" name="Picture 1956998255"/>
                     <pic:cNvPicPr/>
                   </pic:nvPicPr>
                   <pic:blipFill>
-                    <a:blip r:embed="rId15"/>
+                    <a:blip r:embed="rId14" cstate="print">
+                      <a:extLst>
+                        <a:ext uri="{28A0092B-C50C-407E-A947-70E740481C1C}">
+                          <a14:useLocalDpi xmlns:a14="http://schemas.microsoft.com/office/drawing/2010/main" val="0"/>
+                        </a:ext>
+                      </a:extLst>
+                    </a:blip>
                     <a:stretch>
                       <a:fillRect/>
                     </a:stretch>
@@ -1068,7 +700,7 @@
                   <pic:spPr>
                     <a:xfrm>
                       <a:off x="0" y="0"/>
-                      <a:ext cx="5731510" cy="5048885"/>
+                      <a:ext cx="5731510" cy="6584315"/>
                     </a:xfrm>
                     <a:prstGeom prst="rect">
                       <a:avLst/>
@@ -1084,30 +716,6 @@
     <w:p>
       <w:pPr>
         <w:rPr>
-          <w:lang w:val="vi-VN"/>
-        </w:rPr>
-      </w:pPr>
-    </w:p>
-    <w:p>
-      <w:pPr>
-        <w:rPr>
-          <w:lang w:val="vi-VN"/>
-        </w:rPr>
-      </w:pPr>
-      <w:r>
-        <w:t>Features that are not assigned to a user's role are hidden. Users must select the role for which they have been authorized by the administrator in order to access the corresponding functions.</w:t>
-      </w:r>
-    </w:p>
-    <w:p>
-      <w:pPr>
-        <w:rPr>
-          <w:lang w:val="vi-VN"/>
-        </w:rPr>
-      </w:pPr>
-    </w:p>
-    <w:p>
-      <w:pPr>
-        <w:rPr>
           <w:b/>
           <w:bCs/>
           <w:lang w:val="vi-VN"/>
@@ -1117,6 +725,7 @@
         <w:rPr>
           <w:b/>
           <w:bCs/>
+          <w:noProof/>
           <w:lang w:val="vi-VN"/>
         </w:rPr>
         <w:lastRenderedPageBreak/>
@@ -1136,7 +745,7 @@
                     <pic:cNvPicPr/>
                   </pic:nvPicPr>
                   <pic:blipFill>
-                    <a:blip r:embed="rId16"/>
+                    <a:blip r:embed="rId15"/>
                     <a:stretch>
                       <a:fillRect/>
                     </a:stretch>
@@ -1909,6 +1518,7 @@
   <w:style w:type="character" w:default="1" w:styleId="DefaultParagraphFont">
     <w:name w:val="Default Paragraph Font"/>
     <w:uiPriority w:val="1"/>
+    <w:semiHidden/>
     <w:unhideWhenUsed/>
   </w:style>
   <w:style w:type="table" w:default="1" w:styleId="TableNormal">

</xml_diff>